<commit_message>
Shell gates on the rebased tree: the bap8 reply, bap9 answering/opening, ca9 answering/reply and ca7 answering reference builders give way to docx/reference.xml (fb render's docxref, as master's fb-595.63 folders; styles XML-identical, theme-font attributes stripped; every .docx.pdf re-renders byte-identical); bap8 opening and reply docx/render.sh in bash strict mode with a checked mktemp, scratch folders inside it and safe_rmdir cleanup, shellcheck clean, branch counts (76, 77) in .shell-safety-baseline.json. check.sh --engine docx 0 failed with XENG-001..003 PASS in all seven folders; gov pre-commit quality,workflow passes against origin/master and the input commit (fb-595.54.4)
</commit_message>
<xml_diff>
--- a/courts/eighth-circuit/bankruptcy-appellate-panel/reply-brief/usage/OUTPUT-reply-brief.docx
+++ b/courts/eighth-circuit/bankruptcy-appellate-panel/reply-brief/usage/OUTPUT-reply-brief.docx
@@ -1049,7 +1049,7 @@
 </file>
 
 <file path=word/styles.xml><?xml version="1.0" encoding="utf-8"?>
-<w:styles xmlns:r="http://schemas.openxmlformats.org/officeDocument/2006/relationships" xmlns:w="http://schemas.openxmlformats.org/wordprocessingml/2006/main">
+<w:styles xmlns:w="http://schemas.openxmlformats.org/wordprocessingml/2006/main" xmlns:r="http://schemas.openxmlformats.org/officeDocument/2006/relationships">
   <w:docDefaults>
     <w:rPrDefault>
       <w:rPr>
@@ -1109,7 +1109,7 @@
       <w:jc w:val="center"/>
     </w:pPr>
     <w:rPr>
-      <w:rFonts w:asciiTheme="majorHAnsi" w:eastAsiaTheme="majorEastAsia" w:hAnsiTheme="majorHAnsi" w:cstheme="majorBidi"/>
+      <w:rFonts w:cstheme="majorBidi"/>
       <w:sz w:val="56"/>
       <w:szCs w:val="56"/>
     </w:rPr>
@@ -1121,7 +1121,7 @@
     <w:uiPriority w:val="10"/>
     <w:rsid w:val="00A10FD9"/>
     <w:rPr>
-      <w:rFonts w:asciiTheme="majorHAnsi" w:eastAsiaTheme="majorEastAsia" w:hAnsiTheme="majorHAnsi" w:cstheme="majorBidi"/>
+      <w:rFonts w:cstheme="majorBidi"/>
       <w:sz w:val="56"/>
       <w:szCs w:val="56"/>
     </w:rPr>
@@ -1140,7 +1140,7 @@
       </w:numPr>
     </w:pPr>
     <w:rPr>
-      <w:rFonts w:eastAsiaTheme="majorEastAsia" w:cstheme="majorBidi"/>
+      <w:rFonts w:cstheme="majorBidi"/>
       <w:spacing w:val="15"/>
       <w:sz w:val="28"/>
       <w:szCs w:val="28"/>
@@ -1153,7 +1153,7 @@
     <w:uiPriority w:val="11"/>
     <w:rsid w:val="00A10FD9"/>
     <w:rPr>
-      <w:rFonts w:eastAsiaTheme="majorEastAsia" w:cstheme="majorBidi"/>
+      <w:rFonts w:cstheme="majorBidi"/>
       <w:color w:val="595959" w:themeColor="text1" w:themeTint="A6"/>
       <w:spacing w:val="15"/>
       <w:sz w:val="28"/>
@@ -1377,7 +1377,7 @@
       <w:outlineLvl w:val="5"/>
     </w:pPr>
     <w:rPr>
-      <w:rFonts w:eastAsiaTheme="majorEastAsia" w:cstheme="majorBidi"/>
+      <w:rFonts w:cstheme="majorBidi"/>
       <w:i/>
       <w:iCs/>
       <w:color w:val="595959" w:themeColor="text1" w:themeTint="A6"/>
@@ -1400,7 +1400,7 @@
       <w:outlineLvl w:val="6"/>
     </w:pPr>
     <w:rPr>
-      <w:rFonts w:eastAsiaTheme="majorEastAsia" w:cstheme="majorBidi"/>
+      <w:rFonts w:cstheme="majorBidi"/>
       <w:color w:val="595959" w:themeColor="text1" w:themeTint="A6"/>
     </w:rPr>
   </w:style>
@@ -1421,7 +1421,7 @@
       <w:outlineLvl w:val="7"/>
     </w:pPr>
     <w:rPr>
-      <w:rFonts w:eastAsiaTheme="majorEastAsia" w:cstheme="majorBidi"/>
+      <w:rFonts w:cstheme="majorBidi"/>
       <w:i/>
       <w:iCs/>
       <w:color w:val="272727" w:themeColor="text1" w:themeTint="D8"/>
@@ -1444,7 +1444,7 @@
       <w:outlineLvl w:val="8"/>
     </w:pPr>
     <w:rPr>
-      <w:rFonts w:eastAsiaTheme="majorEastAsia" w:cstheme="majorBidi"/>
+      <w:rFonts w:cstheme="majorBidi"/>
       <w:color w:val="272727" w:themeColor="text1" w:themeTint="D8"/>
     </w:rPr>
   </w:style>
@@ -1455,7 +1455,7 @@
     <w:uiPriority w:val="9"/>
     <w:rsid w:val="00A10FD9"/>
     <w:rPr>
-      <w:rFonts w:asciiTheme="majorHAnsi" w:eastAsiaTheme="majorEastAsia" w:hAnsiTheme="majorHAnsi" w:cstheme="majorBidi"/>
+      <w:rFonts w:cstheme="majorBidi"/>
       <w:color w:val="0F4761" w:themeColor="accent1" w:themeShade="BF"/>
       <w:sz w:val="40"/>
       <w:szCs w:val="40"/>
@@ -1469,7 +1469,7 @@
     <w:semiHidden/>
     <w:rsid w:val="00A10FD9"/>
     <w:rPr>
-      <w:rFonts w:asciiTheme="majorHAnsi" w:eastAsiaTheme="majorEastAsia" w:hAnsiTheme="majorHAnsi" w:cstheme="majorBidi"/>
+      <w:rFonts w:cstheme="majorBidi"/>
       <w:color w:val="0F4761" w:themeColor="accent1" w:themeShade="BF"/>
       <w:sz w:val="32"/>
       <w:szCs w:val="32"/>
@@ -1483,7 +1483,7 @@
     <w:semiHidden/>
     <w:rsid w:val="00A10FD9"/>
     <w:rPr>
-      <w:rFonts w:eastAsiaTheme="majorEastAsia" w:cstheme="majorBidi"/>
+      <w:rFonts w:cstheme="majorBidi"/>
       <w:color w:val="0F4761" w:themeColor="accent1" w:themeShade="BF"/>
       <w:sz w:val="28"/>
       <w:szCs w:val="28"/>
@@ -1497,7 +1497,7 @@
     <w:semiHidden/>
     <w:rsid w:val="00A10FD9"/>
     <w:rPr>
-      <w:rFonts w:eastAsiaTheme="majorEastAsia" w:cstheme="majorBidi"/>
+      <w:rFonts w:cstheme="majorBidi"/>
       <w:i/>
       <w:iCs/>
       <w:color w:val="0F4761" w:themeColor="accent1" w:themeShade="BF"/>
@@ -1511,7 +1511,7 @@
     <w:semiHidden/>
     <w:rsid w:val="00A10FD9"/>
     <w:rPr>
-      <w:rFonts w:eastAsiaTheme="majorEastAsia" w:cstheme="majorBidi"/>
+      <w:rFonts w:cstheme="majorBidi"/>
       <w:color w:val="0F4761" w:themeColor="accent1" w:themeShade="BF"/>
     </w:rPr>
   </w:style>
@@ -1523,7 +1523,7 @@
     <w:semiHidden/>
     <w:rsid w:val="00A10FD9"/>
     <w:rPr>
-      <w:rFonts w:eastAsiaTheme="majorEastAsia" w:cstheme="majorBidi"/>
+      <w:rFonts w:cstheme="majorBidi"/>
       <w:i/>
       <w:iCs/>
       <w:color w:val="595959" w:themeColor="text1" w:themeTint="A6"/>
@@ -1537,7 +1537,7 @@
     <w:semiHidden/>
     <w:rsid w:val="00A10FD9"/>
     <w:rPr>
-      <w:rFonts w:eastAsiaTheme="majorEastAsia" w:cstheme="majorBidi"/>
+      <w:rFonts w:cstheme="majorBidi"/>
       <w:color w:val="595959" w:themeColor="text1" w:themeTint="A6"/>
     </w:rPr>
   </w:style>
@@ -1549,7 +1549,7 @@
     <w:semiHidden/>
     <w:rsid w:val="00A10FD9"/>
     <w:rPr>
-      <w:rFonts w:eastAsiaTheme="majorEastAsia" w:cstheme="majorBidi"/>
+      <w:rFonts w:cstheme="majorBidi"/>
       <w:i/>
       <w:iCs/>
       <w:color w:val="272727" w:themeColor="text1" w:themeTint="D8"/>
@@ -1563,7 +1563,7 @@
     <w:semiHidden/>
     <w:rsid w:val="00A10FD9"/>
     <w:rPr>
-      <w:rFonts w:eastAsiaTheme="majorEastAsia" w:cstheme="majorBidi"/>
+      <w:rFonts w:cstheme="majorBidi"/>
       <w:color w:val="272727" w:themeColor="text1" w:themeTint="D8"/>
     </w:rPr>
   </w:style>
@@ -1736,7 +1736,7 @@
       <w:outlineLvl w:val="9"/>
     </w:pPr>
     <w:rPr>
-      <w:rFonts w:asciiTheme="majorHAnsi" w:eastAsiaTheme="majorEastAsia" w:hAnsiTheme="majorHAnsi" w:cstheme="majorBidi"/>
+      <w:rFonts w:cstheme="majorBidi"/>
       <w:b w:val="0"/>
       <w:bCs w:val="0"/>
       <w:color w:val="365F91" w:themeColor="accent1" w:themeShade="BF"/>
@@ -2640,7 +2640,7 @@
     </a:clrScheme>
     <a:fontScheme name="Office">
       <a:majorFont>
-        <a:latin typeface="Aptos Display" panose="02110004020202020204"/>
+        <a:latin typeface="Times New Roman" panose="02110004020202020204"/>
         <a:ea typeface=""/>
         <a:cs typeface=""/>
         <a:font script="Jpan" typeface="游ゴシック Light"/>
@@ -2692,7 +2692,7 @@
         <a:font script="Tfng" typeface="Ebrima"/>
       </a:majorFont>
       <a:minorFont>
-        <a:latin typeface="Aptos" panose="02110004020202020204"/>
+        <a:latin typeface="Times New Roman" panose="02110004020202020204"/>
         <a:ea typeface=""/>
         <a:cs typeface=""/>
         <a:font script="Jpan" typeface="游明朝"/>

</xml_diff>

<commit_message>
BAP 8th Cir. reply brief: docx/render.sh and front.jq give way to the BAP opening brief's port (brief.lua and docx/lib/front.lua on $FORMBOOK_META), with the reply's own front matter rule for rule: the court line's no-break spaces, an empty designation and v: false left out, the appeal title after the BAP number, the L.R. 8014A(b)(1) certification wording, a sample with preliminary refused; baseline entry removed. .docx.pdf byte-identical to the render before the port; check.sh typst and docx 0 failed, XENG-001..003 pass (fb-595.68.2)
</commit_message>
<xml_diff>
--- a/courts/eighth-circuit/bankruptcy-appellate-panel/reply-brief/usage/OUTPUT-reply-brief.docx
+++ b/courts/eighth-circuit/bankruptcy-appellate-panel/reply-brief/usage/OUTPUT-reply-brief.docx
@@ -637,7 +637,7 @@
       <w:pPr>
         <w:spacing w:before="0" w:after="0" w:line="20" w:lineRule="exact"/>
         <w:sectPr>
-          <w:footerReference w:type="default" r:id="rIdBapFooter"/>
+          <w:footerReference w:type="default" r:id="rIdBapPage"/>
           <w:pgSz w:w="12240" w:h="15840"/>
           <w:pgMar w:top="1440" w:right="1440" w:bottom="1440" w:left="1440" w:header="720" w:footer="720" w:gutter="0"/>
           <w:pgNumType w:fmt="lowerRoman" w:start="1"/>
@@ -907,7 +907,7 @@
       </w:r>
     </w:p>
     <w:sectPr>
-      <w:footerReference w:type="default" r:id="rIdBapFooter"/>
+      <w:footerReference w:type="default" r:id="rIdBapPage"/>
       <w:pgSz w:w="12240" w:h="15840"/>
       <w:pgMar w:top="1440" w:right="1440" w:bottom="1440" w:left="1440" w:header="720" w:footer="720" w:gutter="0"/>
       <w:pgNumType w:fmt="decimal" w:start="1"/>
@@ -962,6 +962,97 @@
     </w:p>
   </w:footnote>
 </w:footnotes>
+</file>
+
+<file path=word/ftr-add.xml><?xml version="1.0" encoding="utf-8"?>
+<w:ftr xmlns:w="http://schemas.openxmlformats.org/wordprocessingml/2006/main" xmlns:r="http://schemas.openxmlformats.org/officeDocument/2006/relationships">
+  <w:p>
+    <w:pPr>
+      <w:spacing w:before="0" w:after="0"/>
+      <w:jc w:val="center"/>
+    </w:pPr>
+    <w:r>
+      <w:t>Add-</w:t>
+    </w:r>
+    <w:r>
+      <w:fldChar w:fldCharType="begin"/>
+    </w:r>
+    <w:r>
+      <w:instrText xml:space="preserve"> PAGE </w:instrText>
+    </w:r>
+    <w:r>
+      <w:fldChar w:fldCharType="separate"/>
+    </w:r>
+    <w:r>
+      <w:t>1</w:t>
+    </w:r>
+    <w:r>
+      <w:fldChar w:fldCharType="end"/>
+    </w:r>
+  </w:p>
+</w:ftr>
+</file>
+
+<file path=word/ftr-none.xml><?xml version="1.0" encoding="utf-8"?>
+<w:ftr xmlns:w="http://schemas.openxmlformats.org/wordprocessingml/2006/main" xmlns:r="http://schemas.openxmlformats.org/officeDocument/2006/relationships">
+  <w:p>
+    <w:pPr>
+      <w:spacing w:before="0" w:after="0"/>
+      <w:jc w:val="center"/>
+    </w:pPr>
+  </w:p>
+</w:ftr>
+</file>
+
+<file path=word/ftr-own1.xml><?xml version="1.0" encoding="utf-8"?>
+<w:ftr xmlns:w="http://schemas.openxmlformats.org/wordprocessingml/2006/main" xmlns:r="http://schemas.openxmlformats.org/officeDocument/2006/relationships">
+  <w:p>
+    <w:pPr>
+      <w:jc w:val="center"/>
+    </w:pPr>
+    <w:r>
+      <w:fldChar w:fldCharType="begin"/>
+    </w:r>
+    <w:r>
+      <w:instrText xml:space="preserve"> PAGE </w:instrText>
+    </w:r>
+    <w:r>
+      <w:fldChar w:fldCharType="separate"/>
+    </w:r>
+    <w:r>
+      <w:t>1</w:t>
+    </w:r>
+    <w:r>
+      <w:fldChar w:fldCharType="end"/>
+    </w:r>
+  </w:p>
+</w:ftr>
+</file>
+
+<file path=word/ftr-page.xml><?xml version="1.0" encoding="utf-8"?>
+<w:ftr xmlns:w="http://schemas.openxmlformats.org/wordprocessingml/2006/main" xmlns:r="http://schemas.openxmlformats.org/officeDocument/2006/relationships">
+  <w:p>
+    <w:pPr>
+      <w:spacing w:before="0" w:after="0"/>
+      <w:jc w:val="center"/>
+    </w:pPr>
+    <w:r>
+      <w:fldChar w:fldCharType="begin"/>
+    </w:r>
+    <w:r>
+      <w:instrText xml:space="preserve"> PAGE </w:instrText>
+    </w:r>
+    <w:r>
+      <w:fldChar w:fldCharType="separate"/>
+    </w:r>
+    <w:r>
+      <w:t>1</w:t>
+    </w:r>
+    <w:r>
+      <w:fldChar w:fldCharType="end"/>
+    </w:r>
+  </w:p>
+</w:ftr>
 </file>
 
 <file path=word/numbering.xml><?xml version="1.0" encoding="utf-8"?>

</xml_diff>